<commit_message>
Update resume and industry experience
</commit_message>
<xml_diff>
--- a/resume/resume.docx
+++ b/resume/resume.docx
@@ -4,44 +4,84 @@
   <w:body>
     <w:p>
       <w:pPr>
-        <w:keepNext w:val="0"/>
-        <w:spacing w:before="0" w:after="25" w:line="240" w:lineRule="auto"/>
-        <w:ind w:left="0" w:firstLine="0"/>
+        <w:pStyle w:val="Title"/>
+        <w:keepNext/>
+        <w:spacing w:before="0" w:after="60"/>
         <w:jc w:val="center"/>
       </w:pPr>
       <w:r>
         <w:rPr>
-          <w:rFonts w:ascii="Times New Roman" w:hAnsi="Times New Roman"/>
+          <w:rFonts w:ascii="Arial" w:hAnsi="Arial"/>
           <w:b/>
-          <w:smallCaps/>
+          <w:i w:val="0"/>
           <w:color w:val="000000"/>
-          <w:sz w:val="38"/>
+          <w:sz w:val="40"/>
         </w:rPr>
         <w:t>ZHANHAO (NEO) ZHANG</w:t>
       </w:r>
     </w:p>
     <w:p>
       <w:pPr>
-        <w:keepNext w:val="0"/>
-        <w:spacing w:before="0" w:after="40" w:line="240" w:lineRule="auto"/>
-        <w:ind w:left="0" w:firstLine="0"/>
+        <w:keepNext/>
+        <w:spacing w:before="0" w:after="40"/>
         <w:jc w:val="center"/>
       </w:pPr>
       <w:r>
         <w:rPr>
-          <w:rFonts w:ascii="Arial" w:hAnsi="Arial" w:eastAsia="Arial"/>
+          <w:rFonts w:ascii="Arial" w:hAnsi="Arial"/>
+          <w:b w:val="0"/>
+          <w:i w:val="0"/>
+          <w:color w:val="000000"/>
           <w:sz w:val="18"/>
         </w:rPr>
-        <w:t xml:space="preserve">206-483-5689  |  zz564@cornell.edu  |  zhangz73.github.io  |  </w:t>
+        <w:t xml:space="preserve">206-483-5689  |  </w:t>
+      </w:r>
+      <w:hyperlink r:id="rId12">
+        <w:r>
+          <w:rPr>
+            <w:rFonts w:ascii="Arial" w:hAnsi="Arial"/>
+            <w:sz w:val="18"/>
+            <w:color w:val="000000"/>
+          </w:rPr>
+          <w:t>zz564@cornell.edu</w:t>
+        </w:r>
+      </w:hyperlink>
+      <w:r>
+        <w:rPr>
+          <w:rFonts w:ascii="Arial" w:hAnsi="Arial"/>
+          <w:b w:val="0"/>
+          <w:i w:val="0"/>
+          <w:color w:val="000000"/>
+          <w:sz w:val="18"/>
+        </w:rPr>
+        <w:t xml:space="preserve">  |  </w:t>
+      </w:r>
+      <w:hyperlink r:id="rId13">
+        <w:r>
+          <w:rPr>
+            <w:rFonts w:ascii="Arial" w:hAnsi="Arial"/>
+            <w:sz w:val="18"/>
+            <w:color w:val="000000"/>
+          </w:rPr>
+          <w:t>zhangz73.github.io</w:t>
+        </w:r>
+      </w:hyperlink>
+      <w:r>
+        <w:rPr>
+          <w:rFonts w:ascii="Arial" w:hAnsi="Arial"/>
+          <w:b w:val="0"/>
+          <w:i w:val="0"/>
+          <w:color w:val="000000"/>
+          <w:sz w:val="18"/>
+        </w:rPr>
+        <w:t xml:space="preserve">  |  </w:t>
       </w:r>
       <w:hyperlink r:id="rId9">
         <w:r>
           <w:rPr>
-            <w:rFonts w:ascii="Arial" w:hAnsi="Arial" w:eastAsia="Arial"/>
+            <w:rFonts w:ascii="Arial" w:hAnsi="Arial"/>
             <w:sz w:val="18"/>
-            <w:szCs w:val="18"/>
             <w:color w:val="000000"/>
-            <w:u w:val="none"/>
           </w:rPr>
           <w:t>Google Scholar</w:t>
         </w:r>
@@ -50,806 +90,583 @@
     <w:p>
       <w:pPr>
         <w:keepNext/>
-        <w:spacing w:before="116" w:after="44" w:line="240" w:lineRule="auto"/>
-        <w:ind w:left="0" w:firstLine="0"/>
+        <w:spacing w:before="0" w:after="20"/>
+        <w:jc w:val="center"/>
+      </w:pPr>
+      <w:r>
+        <w:rPr>
+          <w:rFonts w:ascii="Arial" w:hAnsi="Arial"/>
+          <w:b w:val="0"/>
+          <w:i w:val="0"/>
+          <w:color w:val="000000"/>
+          <w:sz w:val="19"/>
+        </w:rPr>
+        <w:t>Reinforcement Learning  |  Stochastic Modeling  |  Optimization</w:t>
+      </w:r>
+    </w:p>
+    <w:p>
+      <w:pPr>
+        <w:pStyle w:val="Heading1"/>
+        <w:keepNext/>
+        <w:spacing w:before="120" w:after="60"/>
         <w:jc w:val="center"/>
         <w:pBdr>
-          <w:bottom w:val="single" w:sz="7" w:space="1" w:color="000000"/>
+          <w:bottom w:val="single" w:sz="4" w:space="2" w:color="555555"/>
         </w:pBdr>
       </w:pPr>
       <w:r>
         <w:rPr>
           <w:rFonts w:ascii="Arial" w:hAnsi="Arial"/>
           <w:b/>
+          <w:i w:val="0"/>
           <w:color w:val="000000"/>
           <w:sz w:val="21"/>
         </w:rPr>
         <w:t>EDUCATION</w:t>
       </w:r>
     </w:p>
-    <w:tbl>
-      <w:tblPr>
-        <w:tblW w:type="auto" w:w="0"/>
-        <w:jc w:val="center"/>
-        <w:tblLayout w:type="fixed"/>
-        <w:tblLook w:firstColumn="1" w:firstRow="1" w:lastColumn="0" w:lastRow="0" w:noHBand="0" w:noVBand="1" w:val="04A0"/>
-        <w:tblBorders>
-          <w:top w:val="nil"/>
-          <w:left w:val="nil"/>
-          <w:bottom w:val="nil"/>
-          <w:right w:val="nil"/>
-          <w:insideH w:val="nil"/>
-          <w:insideV w:val="nil"/>
-        </w:tblBorders>
-      </w:tblPr>
-      <w:tblGrid>
-        <w:gridCol w:w="8280"/>
-        <w:gridCol w:w="2131"/>
-      </w:tblGrid>
-      <w:tr>
-        <w:tc>
-          <w:tcPr>
-            <w:tcW w:type="dxa" w:w="5184"/>
-            <w:tcMar>
-              <w:top w:w="0" w:type="dxa"/>
-              <w:start w:w="0" w:type="dxa"/>
-              <w:bottom w:w="0" w:type="dxa"/>
-              <w:end w:w="0" w:type="dxa"/>
-            </w:tcMar>
-            <w:vAlign w:val="center"/>
-          </w:tcPr>
-          <w:p>
-            <w:pPr>
-              <w:keepNext w:val="0"/>
-              <w:spacing w:before="0" w:after="0" w:line="240" w:lineRule="auto"/>
-              <w:ind w:left="0" w:firstLine="0"/>
-            </w:pPr>
-            <w:r>
-              <w:rPr>
-                <w:rFonts w:ascii="Arial" w:hAnsi="Arial"/>
-                <w:b/>
-                <w:color w:val="000000"/>
-                <w:sz w:val="19"/>
-              </w:rPr>
-              <w:t>Cornell University, Ithaca, NY</w:t>
-            </w:r>
-          </w:p>
-        </w:tc>
-        <w:tc>
-          <w:tcPr>
-            <w:tcW w:type="dxa" w:w="5184"/>
-            <w:tcMar>
-              <w:top w:w="0" w:type="dxa"/>
-              <w:start w:w="0" w:type="dxa"/>
-              <w:bottom w:w="0" w:type="dxa"/>
-              <w:end w:w="0" w:type="dxa"/>
-            </w:tcMar>
-            <w:vAlign w:val="center"/>
-          </w:tcPr>
-          <w:p>
-            <w:pPr>
-              <w:keepNext w:val="0"/>
-              <w:spacing w:before="0" w:after="0" w:line="240" w:lineRule="auto"/>
-              <w:ind w:left="0" w:firstLine="0"/>
-              <w:jc w:val="right"/>
-            </w:pPr>
-            <w:r>
-              <w:rPr>
-                <w:rFonts w:ascii="Arial" w:hAnsi="Arial"/>
-                <w:color w:val="000000"/>
-                <w:sz w:val="19"/>
-              </w:rPr>
-              <w:t>Expected May 2027</w:t>
-            </w:r>
-          </w:p>
-        </w:tc>
-      </w:tr>
-    </w:tbl>
     <w:p>
       <w:pPr>
-        <w:keepNext w:val="0"/>
-        <w:spacing w:before="0" w:after="8" w:line="240" w:lineRule="auto"/>
-        <w:ind w:left="115" w:firstLine="0"/>
+        <w:keepNext/>
+        <w:tabs>
+          <w:tab w:pos="10570" w:val="right"/>
+        </w:tabs>
+        <w:spacing w:before="0" w:after="0"/>
       </w:pPr>
       <w:r>
         <w:rPr>
           <w:rFonts w:ascii="Arial" w:hAnsi="Arial"/>
+          <w:b/>
+          <w:i w:val="0"/>
           <w:color w:val="000000"/>
-          <w:sz w:val="18"/>
+          <w:sz w:val="20"/>
         </w:rPr>
-        <w:t>Ph.D. in Operations Research</w:t>
+        <w:t>Cornell University | Ph.D. in Operations Research</w:t>
       </w:r>
       <w:r>
         <w:rPr>
           <w:rFonts w:ascii="Arial" w:hAnsi="Arial"/>
+          <w:b w:val="0"/>
+          <w:i w:val="0"/>
           <w:color w:val="000000"/>
-          <w:sz w:val="18"/>
+          <w:sz w:val="20"/>
         </w:rPr>
-        <w:t xml:space="preserve">  |  Advisors: Jim Dai, Manxi Wu</w:t>
+        <w:tab/>
+        <w:t>Expected May 2027</w:t>
       </w:r>
     </w:p>
-    <w:tbl>
-      <w:tblPr>
-        <w:tblW w:type="auto" w:w="0"/>
-        <w:jc w:val="center"/>
-        <w:tblLayout w:type="fixed"/>
-        <w:tblLook w:firstColumn="1" w:firstRow="1" w:lastColumn="0" w:lastRow="0" w:noHBand="0" w:noVBand="1" w:val="04A0"/>
-        <w:tblBorders>
-          <w:top w:val="nil"/>
-          <w:left w:val="nil"/>
-          <w:bottom w:val="nil"/>
-          <w:right w:val="nil"/>
-          <w:insideH w:val="nil"/>
-          <w:insideV w:val="nil"/>
-        </w:tblBorders>
-      </w:tblPr>
-      <w:tblGrid>
-        <w:gridCol w:w="8280"/>
-        <w:gridCol w:w="2131"/>
-      </w:tblGrid>
-      <w:tr>
-        <w:tc>
-          <w:tcPr>
-            <w:tcW w:type="dxa" w:w="5184"/>
-            <w:tcMar>
-              <w:top w:w="0" w:type="dxa"/>
-              <w:start w:w="0" w:type="dxa"/>
-              <w:bottom w:w="0" w:type="dxa"/>
-              <w:end w:w="0" w:type="dxa"/>
-            </w:tcMar>
-            <w:vAlign w:val="center"/>
-          </w:tcPr>
-          <w:p>
-            <w:pPr>
-              <w:keepNext w:val="0"/>
-              <w:spacing w:before="0" w:after="0" w:line="240" w:lineRule="auto"/>
-              <w:ind w:left="0" w:firstLine="0"/>
-            </w:pPr>
-            <w:r>
-              <w:rPr>
-                <w:rFonts w:ascii="Arial" w:hAnsi="Arial"/>
-                <w:b/>
-                <w:color w:val="000000"/>
-                <w:sz w:val="19"/>
-              </w:rPr>
-              <w:t>Columbia University, New York, NY</w:t>
-            </w:r>
-          </w:p>
-        </w:tc>
-        <w:tc>
-          <w:tcPr>
-            <w:tcW w:type="dxa" w:w="5184"/>
-            <w:tcMar>
-              <w:top w:w="0" w:type="dxa"/>
-              <w:start w:w="0" w:type="dxa"/>
-              <w:bottom w:w="0" w:type="dxa"/>
-              <w:end w:w="0" w:type="dxa"/>
-            </w:tcMar>
-            <w:vAlign w:val="center"/>
-          </w:tcPr>
-          <w:p>
-            <w:pPr>
-              <w:keepNext w:val="0"/>
-              <w:spacing w:before="0" w:after="0" w:line="240" w:lineRule="auto"/>
-              <w:ind w:left="0" w:firstLine="0"/>
-              <w:jc w:val="right"/>
-            </w:pPr>
-            <w:r>
-              <w:rPr>
-                <w:rFonts w:ascii="Arial" w:hAnsi="Arial"/>
-                <w:color w:val="000000"/>
-                <w:sz w:val="19"/>
-              </w:rPr>
-              <w:t>Feb 2022</w:t>
-            </w:r>
-          </w:p>
-        </w:tc>
-      </w:tr>
-    </w:tbl>
     <w:p>
       <w:pPr>
         <w:keepNext w:val="0"/>
-        <w:spacing w:before="0" w:after="8" w:line="240" w:lineRule="auto"/>
-        <w:ind w:left="115" w:firstLine="0"/>
+        <w:spacing w:before="0" w:after="40"/>
       </w:pPr>
       <w:r>
         <w:rPr>
           <w:rFonts w:ascii="Arial" w:hAnsi="Arial"/>
+          <w:b w:val="0"/>
+          <w:i w:val="0"/>
           <w:color w:val="000000"/>
-          <w:sz w:val="18"/>
+          <w:sz w:val="19"/>
         </w:rPr>
-        <w:t>M.A. in Statistics</w:t>
-      </w:r>
-    </w:p>
-    <w:tbl>
-      <w:tblPr>
-        <w:tblW w:type="auto" w:w="0"/>
-        <w:jc w:val="center"/>
-        <w:tblLayout w:type="fixed"/>
-        <w:tblLook w:firstColumn="1" w:firstRow="1" w:lastColumn="0" w:lastRow="0" w:noHBand="0" w:noVBand="1" w:val="04A0"/>
-        <w:tblBorders>
-          <w:top w:val="nil"/>
-          <w:left w:val="nil"/>
-          <w:bottom w:val="nil"/>
-          <w:right w:val="nil"/>
-          <w:insideH w:val="nil"/>
-          <w:insideV w:val="nil"/>
-        </w:tblBorders>
-      </w:tblPr>
-      <w:tblGrid>
-        <w:gridCol w:w="8280"/>
-        <w:gridCol w:w="2131"/>
-      </w:tblGrid>
-      <w:tr>
-        <w:tc>
-          <w:tcPr>
-            <w:tcW w:type="dxa" w:w="5184"/>
-            <w:tcMar>
-              <w:top w:w="0" w:type="dxa"/>
-              <w:start w:w="0" w:type="dxa"/>
-              <w:bottom w:w="0" w:type="dxa"/>
-              <w:end w:w="0" w:type="dxa"/>
-            </w:tcMar>
-            <w:vAlign w:val="center"/>
-          </w:tcPr>
-          <w:p>
-            <w:pPr>
-              <w:keepNext w:val="0"/>
-              <w:spacing w:before="0" w:after="0" w:line="240" w:lineRule="auto"/>
-              <w:ind w:left="0" w:firstLine="0"/>
-            </w:pPr>
-            <w:r>
-              <w:rPr>
-                <w:rFonts w:ascii="Arial" w:hAnsi="Arial"/>
-                <w:b/>
-                <w:color w:val="000000"/>
-                <w:sz w:val="19"/>
-              </w:rPr>
-              <w:t>University of Washington, Seattle, WA</w:t>
-            </w:r>
-          </w:p>
-        </w:tc>
-        <w:tc>
-          <w:tcPr>
-            <w:tcW w:type="dxa" w:w="5184"/>
-            <w:tcMar>
-              <w:top w:w="0" w:type="dxa"/>
-              <w:start w:w="0" w:type="dxa"/>
-              <w:bottom w:w="0" w:type="dxa"/>
-              <w:end w:w="0" w:type="dxa"/>
-            </w:tcMar>
-            <w:vAlign w:val="center"/>
-          </w:tcPr>
-          <w:p>
-            <w:pPr>
-              <w:keepNext w:val="0"/>
-              <w:spacing w:before="0" w:after="0" w:line="240" w:lineRule="auto"/>
-              <w:ind w:left="0" w:firstLine="0"/>
-              <w:jc w:val="right"/>
-            </w:pPr>
-            <w:r>
-              <w:rPr>
-                <w:rFonts w:ascii="Arial" w:hAnsi="Arial"/>
-                <w:color w:val="000000"/>
-                <w:sz w:val="19"/>
-              </w:rPr>
-              <w:t>Jun 2020</w:t>
-            </w:r>
-          </w:p>
-        </w:tc>
-      </w:tr>
-    </w:tbl>
-    <w:p>
-      <w:pPr>
-        <w:keepNext w:val="0"/>
-        <w:spacing w:before="0" w:after="3" w:line="240" w:lineRule="auto"/>
-        <w:ind w:left="115" w:firstLine="0"/>
-      </w:pPr>
-      <w:r>
-        <w:rPr>
-          <w:rFonts w:ascii="Arial" w:hAnsi="Arial"/>
-          <w:color w:val="000000"/>
-          <w:sz w:val="18"/>
-        </w:rPr>
-        <w:t>B.S. in Computer Science; B.S. in Statistics</w:t>
+        <w:t>Advisors: Jim Dai and Manxi Wu</w:t>
       </w:r>
     </w:p>
     <w:p>
       <w:pPr>
         <w:keepNext/>
-        <w:spacing w:before="116" w:after="44" w:line="240" w:lineRule="auto"/>
-        <w:ind w:left="0" w:firstLine="0"/>
+        <w:tabs>
+          <w:tab w:pos="10570" w:val="right"/>
+        </w:tabs>
+        <w:spacing w:before="0" w:after="40"/>
+      </w:pPr>
+      <w:r>
+        <w:rPr>
+          <w:rFonts w:ascii="Arial" w:hAnsi="Arial"/>
+          <w:b/>
+          <w:i w:val="0"/>
+          <w:color w:val="000000"/>
+          <w:sz w:val="20"/>
+        </w:rPr>
+        <w:t>Columbia University | M.A. in Statistics</w:t>
+      </w:r>
+      <w:r>
+        <w:rPr>
+          <w:rFonts w:ascii="Arial" w:hAnsi="Arial"/>
+          <w:b w:val="0"/>
+          <w:i w:val="0"/>
+          <w:color w:val="000000"/>
+          <w:sz w:val="20"/>
+        </w:rPr>
+        <w:tab/>
+        <w:t>Feb 2022</w:t>
+      </w:r>
+    </w:p>
+    <w:p>
+      <w:pPr>
+        <w:keepNext w:val="0"/>
+        <w:tabs>
+          <w:tab w:pos="10570" w:val="right"/>
+        </w:tabs>
+        <w:spacing w:before="0" w:after="0"/>
+      </w:pPr>
+      <w:r>
+        <w:rPr>
+          <w:rFonts w:ascii="Arial" w:hAnsi="Arial"/>
+          <w:b/>
+          <w:i w:val="0"/>
+          <w:color w:val="000000"/>
+          <w:sz w:val="19"/>
+        </w:rPr>
+        <w:t>University of Washington | B.S. in Computer Science; B.S. in Statistics</w:t>
+      </w:r>
+      <w:r>
+        <w:rPr>
+          <w:rFonts w:ascii="Arial" w:hAnsi="Arial"/>
+          <w:b w:val="0"/>
+          <w:i w:val="0"/>
+          <w:color w:val="000000"/>
+          <w:sz w:val="19"/>
+        </w:rPr>
+        <w:tab/>
+        <w:t>Jun 2020</w:t>
+      </w:r>
+    </w:p>
+    <w:p>
+      <w:pPr>
+        <w:pStyle w:val="Heading1"/>
+        <w:keepNext/>
+        <w:spacing w:before="120" w:after="60"/>
         <w:jc w:val="center"/>
         <w:pBdr>
-          <w:bottom w:val="single" w:sz="7" w:space="1" w:color="000000"/>
+          <w:bottom w:val="single" w:sz="4" w:space="2" w:color="555555"/>
         </w:pBdr>
       </w:pPr>
       <w:r>
         <w:rPr>
           <w:rFonts w:ascii="Arial" w:hAnsi="Arial"/>
           <w:b/>
+          <w:i w:val="0"/>
           <w:color w:val="000000"/>
           <w:sz w:val="21"/>
         </w:rPr>
         <w:t>INDUSTRY EXPERIENCE</w:t>
       </w:r>
     </w:p>
-    <w:tbl>
-      <w:tblPr>
-        <w:tblW w:type="auto" w:w="0"/>
-        <w:jc w:val="center"/>
-        <w:tblLayout w:type="fixed"/>
-        <w:tblLook w:firstColumn="1" w:firstRow="1" w:lastColumn="0" w:lastRow="0" w:noHBand="0" w:noVBand="1" w:val="04A0"/>
-        <w:tblBorders>
-          <w:top w:val="nil"/>
-          <w:left w:val="nil"/>
-          <w:bottom w:val="nil"/>
-          <w:right w:val="nil"/>
-          <w:insideH w:val="nil"/>
-          <w:insideV w:val="nil"/>
-        </w:tblBorders>
-      </w:tblPr>
-      <w:tblGrid>
-        <w:gridCol w:w="8280"/>
-        <w:gridCol w:w="2131"/>
-      </w:tblGrid>
-      <w:tr>
-        <w:tc>
-          <w:tcPr>
-            <w:tcW w:type="dxa" w:w="5184"/>
-            <w:tcMar>
-              <w:top w:w="0" w:type="dxa"/>
-              <w:start w:w="0" w:type="dxa"/>
-              <w:bottom w:w="0" w:type="dxa"/>
-              <w:end w:w="0" w:type="dxa"/>
-            </w:tcMar>
-            <w:vAlign w:val="center"/>
-          </w:tcPr>
-          <w:p>
-            <w:pPr>
-              <w:keepNext w:val="0"/>
-              <w:spacing w:before="0" w:after="0" w:line="240" w:lineRule="auto"/>
-              <w:ind w:left="0" w:firstLine="0"/>
-            </w:pPr>
-            <w:r>
-              <w:rPr>
-                <w:rFonts w:ascii="Arial" w:hAnsi="Arial"/>
-                <w:b/>
-                <w:color w:val="000000"/>
-                <w:sz w:val="19"/>
-              </w:rPr>
-              <w:t>Meta, Seattle, WA</w:t>
-            </w:r>
-          </w:p>
-        </w:tc>
-        <w:tc>
-          <w:tcPr>
-            <w:tcW w:type="dxa" w:w="5184"/>
-            <w:tcMar>
-              <w:top w:w="0" w:type="dxa"/>
-              <w:start w:w="0" w:type="dxa"/>
-              <w:bottom w:w="0" w:type="dxa"/>
-              <w:end w:w="0" w:type="dxa"/>
-            </w:tcMar>
-            <w:vAlign w:val="center"/>
-          </w:tcPr>
-          <w:p>
-            <w:pPr>
-              <w:keepNext w:val="0"/>
-              <w:spacing w:before="0" w:after="0" w:line="240" w:lineRule="auto"/>
-              <w:ind w:left="0" w:firstLine="0"/>
-              <w:jc w:val="right"/>
-            </w:pPr>
-            <w:r>
-              <w:rPr>
-                <w:rFonts w:ascii="Arial" w:hAnsi="Arial"/>
-                <w:color w:val="000000"/>
-                <w:sz w:val="19"/>
-              </w:rPr>
-              <w:t>May 2026 - Aug 2026</w:t>
-            </w:r>
-          </w:p>
-        </w:tc>
-      </w:tr>
-    </w:tbl>
     <w:p>
       <w:pPr>
-        <w:keepNext w:val="0"/>
-        <w:spacing w:before="0" w:after="9" w:line="240" w:lineRule="auto"/>
-        <w:ind w:left="0" w:firstLine="0"/>
+        <w:keepNext/>
+        <w:tabs>
+          <w:tab w:pos="10570" w:val="right"/>
+        </w:tabs>
+        <w:spacing w:before="0" w:after="40"/>
       </w:pPr>
       <w:r>
         <w:rPr>
           <w:rFonts w:ascii="Arial" w:hAnsi="Arial"/>
           <w:b/>
+          <w:i w:val="0"/>
           <w:color w:val="000000"/>
-          <w:sz w:val="18"/>
+          <w:sz w:val="20"/>
         </w:rPr>
-        <w:t>MACHINE LEARNING INTERN</w:t>
+        <w:t>Meta | Research Intern, Machine Learning (PhD)</w:t>
+      </w:r>
+      <w:r>
+        <w:rPr>
+          <w:rFonts w:ascii="Arial" w:hAnsi="Arial"/>
+          <w:b w:val="0"/>
+          <w:i w:val="0"/>
+          <w:color w:val="000000"/>
+          <w:sz w:val="20"/>
+        </w:rPr>
+        <w:tab/>
+        <w:t>May 2026 - Aug 2026</w:t>
       </w:r>
     </w:p>
     <w:p>
       <w:pPr>
         <w:keepNext w:val="0"/>
-        <w:spacing w:before="0" w:after="9" w:line="250" w:lineRule="auto"/>
-        <w:ind w:left="317" w:hanging="173"/>
+        <w:spacing w:before="0" w:after="40"/>
+        <w:ind w:left="170" w:hanging="130"/>
+        <w:numPr>
+          <w:ilvl w:val="0"/>
+          <w:numId w:val="10"/>
+        </w:numPr>
       </w:pPr>
       <w:r>
         <w:rPr>
-          <w:rFonts w:ascii="Arial" w:hAnsi="Arial" w:eastAsia="Arial"/>
-          <w:sz w:val="19"/>
+          <w:rFonts w:ascii="Arial" w:hAnsi="Arial"/>
+          <w:b w:val="0"/>
+          <w:i w:val="0"/>
+          <w:color w:val="000000"/>
+          <w:sz w:val="20"/>
         </w:rPr>
-        <w:t xml:space="preserve">• </w:t>
-      </w:r>
-      <w:r>
-        <w:rPr>
-          <w:rFonts w:ascii="Arial" w:hAnsi="Arial" w:eastAsia="Arial"/>
-          <w:sz w:val="19"/>
-        </w:rPr>
-        <w:t>Built an LLM-based advertiser simulation framework to model budget-allocation decisions without direct competitor data, using advertiser trajectories and personas to capture responses to Meta's relative positioning.</w:t>
+        <w:t>Defined the research approach for an open-ended pilot project to select truthful supplemental campaign-performance signals for third-party AI advisers allocating advertiser budgets across publishers.</w:t>
       </w:r>
     </w:p>
     <w:p>
       <w:pPr>
         <w:keepNext w:val="0"/>
-        <w:spacing w:before="0" w:after="9" w:line="250" w:lineRule="auto"/>
-        <w:ind w:left="317" w:hanging="173"/>
+        <w:spacing w:before="0" w:after="40"/>
+        <w:ind w:left="170" w:hanging="130"/>
+        <w:numPr>
+          <w:ilvl w:val="0"/>
+          <w:numId w:val="10"/>
+        </w:numPr>
       </w:pPr>
       <w:r>
         <w:rPr>
-          <w:rFonts w:ascii="Arial" w:hAnsi="Arial" w:eastAsia="Arial"/>
-          <w:sz w:val="19"/>
+          <w:rFonts w:ascii="Arial" w:hAnsi="Arial"/>
+          <w:b w:val="0"/>
+          <w:i w:val="0"/>
+          <w:color w:val="000000"/>
+          <w:sz w:val="20"/>
         </w:rPr>
-        <w:t xml:space="preserve">• </w:t>
-      </w:r>
-      <w:r>
-        <w:rPr>
-          <w:rFonts w:ascii="Arial" w:hAnsi="Arial" w:eastAsia="Arial"/>
-          <w:sz w:val="19"/>
-        </w:rPr>
-        <w:t>Developed a counterfactual evaluation framework to estimate advertiser responses to alternative signal strategies, overcoming the limitation that historical data capture only realized decisions rather than outcomes under unobserved alternatives.</w:t>
+        <w:t>Built a market simulator for counterfactual scenarios using literature-based transition equations with parameters calibrated to campaign data; compared simulated and observed trajectory distributions using KS and moment tests. Modeled unknown competitor performance using scenarios of Meta's performance relative to other publishers.</w:t>
       </w:r>
     </w:p>
     <w:p>
       <w:pPr>
         <w:keepNext w:val="0"/>
-        <w:spacing w:before="0" w:after="9" w:line="250" w:lineRule="auto"/>
-        <w:ind w:left="317" w:hanging="173"/>
+        <w:spacing w:before="0" w:after="40"/>
+        <w:ind w:left="170" w:hanging="130"/>
+        <w:numPr>
+          <w:ilvl w:val="0"/>
+          <w:numId w:val="10"/>
+        </w:numPr>
       </w:pPr>
       <w:r>
         <w:rPr>
           <w:rFonts w:ascii="Arial" w:hAnsi="Arial"/>
+          <w:b w:val="0"/>
+          <w:i w:val="0"/>
           <w:color w:val="000000"/>
-          <w:sz w:val="19"/>
+          <w:sz w:val="20"/>
         </w:rPr>
-        <w:t xml:space="preserve">• </w:t>
-      </w:r>
-      <w:r>
-        <w:rPr>
-          <w:rFonts w:ascii="Arial" w:hAnsi="Arial"/>
-          <w:color w:val="000000"/>
-          <w:sz w:val="19"/>
-        </w:rPr>
-        <w:t>Designed an interpretable LLM-augmented reinforcement learning method over fixed-structure decision-tree policies, enabling policy optimization while satisfying interpretability and low-latency serving requirements.</w:t>
+        <w:t>Built an agentic system that uses multi-round adversarial debate among LLM agents role-playing domain experts to design interpretable decision graphs; trained graph parameters with LLM-guided updates and policy-gradient RL for deterministic, low-latency serving.</w:t>
       </w:r>
     </w:p>
     <w:p>
       <w:pPr>
         <w:keepNext w:val="0"/>
-        <w:spacing w:before="0" w:after="14" w:line="250" w:lineRule="auto"/>
-        <w:ind w:left="317" w:hanging="173"/>
+        <w:spacing w:before="0" w:after="40"/>
+        <w:ind w:left="170" w:hanging="130"/>
+        <w:numPr>
+          <w:ilvl w:val="0"/>
+          <w:numId w:val="10"/>
+        </w:numPr>
       </w:pPr>
       <w:r>
         <w:rPr>
           <w:rFonts w:ascii="Arial" w:hAnsi="Arial"/>
+          <w:b w:val="0"/>
+          <w:i w:val="0"/>
           <w:color w:val="000000"/>
-          <w:sz w:val="19"/>
+          <w:sz w:val="20"/>
         </w:rPr>
-        <w:t xml:space="preserve">• </w:t>
+        <w:t xml:space="preserve">Reduced advertiser budget cuts or increased allocations to Meta in </w:t>
       </w:r>
       <w:r>
         <w:rPr>
           <w:rFonts w:ascii="Arial" w:hAnsi="Arial"/>
+          <w:b/>
+          <w:i w:val="0"/>
           <w:color w:val="000000"/>
-          <w:sz w:val="19"/>
+          <w:sz w:val="20"/>
         </w:rPr>
-        <w:t>Redesigned the simulation pipeline with parallelization and caching, reducing end-to-end runtime by ~6x and model-serving cost by ~20x; core trajectory-generation components were adopted by the broader team.</w:t>
+        <w:t>20%</w:t>
+      </w:r>
+      <w:r>
+        <w:rPr>
+          <w:rFonts w:ascii="Arial" w:hAnsi="Arial"/>
+          <w:b w:val="0"/>
+          <w:i w:val="0"/>
+          <w:color w:val="000000"/>
+          <w:sz w:val="20"/>
+        </w:rPr>
+        <w:t xml:space="preserve"> of evaluated simulation scenarios compared with a no-steering baseline.</w:t>
       </w:r>
     </w:p>
-    <w:tbl>
-      <w:tblPr>
-        <w:tblW w:type="auto" w:w="0"/>
-        <w:jc w:val="center"/>
-        <w:tblLayout w:type="fixed"/>
-        <w:tblLook w:firstColumn="1" w:firstRow="1" w:lastColumn="0" w:lastRow="0" w:noHBand="0" w:noVBand="1" w:val="04A0"/>
-        <w:tblBorders>
-          <w:top w:val="nil"/>
-          <w:left w:val="nil"/>
-          <w:bottom w:val="nil"/>
-          <w:right w:val="nil"/>
-          <w:insideH w:val="nil"/>
-          <w:insideV w:val="nil"/>
-        </w:tblBorders>
-      </w:tblPr>
-      <w:tblGrid>
-        <w:gridCol w:w="8280"/>
-        <w:gridCol w:w="2131"/>
-      </w:tblGrid>
-      <w:tr>
-        <w:tc>
-          <w:tcPr>
-            <w:tcW w:type="dxa" w:w="5184"/>
-            <w:tcMar>
-              <w:top w:w="0" w:type="dxa"/>
-              <w:start w:w="0" w:type="dxa"/>
-              <w:bottom w:w="0" w:type="dxa"/>
-              <w:end w:w="0" w:type="dxa"/>
-            </w:tcMar>
-            <w:vAlign w:val="center"/>
-          </w:tcPr>
-          <w:p>
-            <w:pPr>
-              <w:keepNext w:val="0"/>
-              <w:spacing w:before="0" w:after="0" w:line="240" w:lineRule="auto"/>
-              <w:ind w:left="0" w:firstLine="0"/>
-            </w:pPr>
-            <w:r>
-              <w:rPr>
-                <w:rFonts w:ascii="Arial" w:hAnsi="Arial"/>
-                <w:b/>
-                <w:color w:val="000000"/>
-                <w:sz w:val="19"/>
-              </w:rPr>
-              <w:t>Akamai Technologies, Boston, MA</w:t>
-            </w:r>
-          </w:p>
-        </w:tc>
-        <w:tc>
-          <w:tcPr>
-            <w:tcW w:type="dxa" w:w="5184"/>
-            <w:tcMar>
-              <w:top w:w="0" w:type="dxa"/>
-              <w:start w:w="0" w:type="dxa"/>
-              <w:bottom w:w="0" w:type="dxa"/>
-              <w:end w:w="0" w:type="dxa"/>
-            </w:tcMar>
-            <w:vAlign w:val="center"/>
-          </w:tcPr>
-          <w:p>
-            <w:pPr>
-              <w:keepNext w:val="0"/>
-              <w:spacing w:before="0" w:after="0" w:line="240" w:lineRule="auto"/>
-              <w:ind w:left="0" w:firstLine="0"/>
-              <w:jc w:val="right"/>
-            </w:pPr>
-            <w:r>
-              <w:rPr>
-                <w:rFonts w:ascii="Arial" w:hAnsi="Arial"/>
-                <w:color w:val="000000"/>
-                <w:sz w:val="19"/>
-              </w:rPr>
-              <w:t>Jun 2025 - Aug 2025</w:t>
-            </w:r>
-          </w:p>
-        </w:tc>
-      </w:tr>
-    </w:tbl>
     <w:p>
       <w:pPr>
         <w:keepNext w:val="0"/>
-        <w:spacing w:before="0" w:after="9" w:line="240" w:lineRule="auto"/>
-        <w:ind w:left="0" w:firstLine="0"/>
+        <w:spacing w:before="0" w:after="40"/>
+        <w:ind w:left="170" w:hanging="130"/>
+        <w:numPr>
+          <w:ilvl w:val="0"/>
+          <w:numId w:val="10"/>
+        </w:numPr>
+      </w:pPr>
+      <w:r>
+        <w:rPr>
+          <w:rFonts w:ascii="Arial" w:hAnsi="Arial"/>
+          <w:b w:val="0"/>
+          <w:i w:val="0"/>
+          <w:color w:val="000000"/>
+          <w:sz w:val="20"/>
+        </w:rPr>
+        <w:t xml:space="preserve">Accelerated simulation by </w:t>
+      </w:r>
+      <w:r>
+        <w:rPr>
+          <w:rFonts w:ascii="Arial" w:hAnsi="Arial"/>
+          <w:b/>
+          <w:i w:val="0"/>
+          <w:color w:val="000000"/>
+          <w:sz w:val="20"/>
+        </w:rPr>
+        <w:t>~6x</w:t>
+      </w:r>
+      <w:r>
+        <w:rPr>
+          <w:rFonts w:ascii="Arial" w:hAnsi="Arial"/>
+          <w:b w:val="0"/>
+          <w:i w:val="0"/>
+          <w:color w:val="000000"/>
+          <w:sz w:val="20"/>
+        </w:rPr>
+        <w:t xml:space="preserve"> and cut model-serving costs to </w:t>
+      </w:r>
+      <w:r>
+        <w:rPr>
+          <w:rFonts w:ascii="Arial" w:hAnsi="Arial"/>
+          <w:b/>
+          <w:i w:val="0"/>
+          <w:color w:val="000000"/>
+          <w:sz w:val="20"/>
+        </w:rPr>
+        <w:t>~1/20</w:t>
+      </w:r>
+      <w:r>
+        <w:rPr>
+          <w:rFonts w:ascii="Arial" w:hAnsi="Arial"/>
+          <w:b w:val="0"/>
+          <w:i w:val="0"/>
+          <w:color w:val="000000"/>
+          <w:sz w:val="20"/>
+        </w:rPr>
+        <w:t xml:space="preserve"> of baseline through parallelization and caching; the team adopted the simulator and steering-policy outputs for </w:t>
+      </w:r>
+      <w:r>
+        <w:rPr>
+          <w:rFonts w:ascii="Arial" w:hAnsi="Arial"/>
+          <w:b/>
+          <w:i w:val="0"/>
+          <w:color w:val="000000"/>
+          <w:sz w:val="20"/>
+        </w:rPr>
+        <w:t>production integration</w:t>
+      </w:r>
+      <w:r>
+        <w:rPr>
+          <w:rFonts w:ascii="Arial" w:hAnsi="Arial"/>
+          <w:b w:val="0"/>
+          <w:i w:val="0"/>
+          <w:color w:val="000000"/>
+          <w:sz w:val="20"/>
+        </w:rPr>
+        <w:t>.</w:t>
+      </w:r>
+    </w:p>
+    <w:p>
+      <w:pPr>
+        <w:keepNext/>
+        <w:tabs>
+          <w:tab w:pos="10570" w:val="right"/>
+        </w:tabs>
+        <w:spacing w:before="80" w:after="40"/>
       </w:pPr>
       <w:r>
         <w:rPr>
           <w:rFonts w:ascii="Arial" w:hAnsi="Arial"/>
           <w:b/>
+          <w:i w:val="0"/>
           <w:color w:val="000000"/>
-          <w:sz w:val="18"/>
+          <w:sz w:val="20"/>
         </w:rPr>
-        <w:t>RESEARCH INTERN, MAPPING</w:t>
+        <w:t>Akamai Technologies | Research Intern, Mapping</w:t>
+      </w:r>
+      <w:r>
+        <w:rPr>
+          <w:rFonts w:ascii="Arial" w:hAnsi="Arial"/>
+          <w:b w:val="0"/>
+          <w:i w:val="0"/>
+          <w:color w:val="000000"/>
+          <w:sz w:val="20"/>
+        </w:rPr>
+        <w:tab/>
+        <w:t>Jun 2025 - Aug 2025</w:t>
       </w:r>
     </w:p>
     <w:p>
       <w:pPr>
         <w:keepNext w:val="0"/>
-        <w:spacing w:before="0" w:after="9" w:line="250" w:lineRule="auto"/>
-        <w:ind w:left="317" w:hanging="173"/>
+        <w:spacing w:before="0" w:after="40"/>
+        <w:ind w:left="170" w:hanging="130"/>
+        <w:numPr>
+          <w:ilvl w:val="0"/>
+          <w:numId w:val="10"/>
+        </w:numPr>
       </w:pPr>
       <w:r>
         <w:rPr>
           <w:rFonts w:ascii="Arial" w:hAnsi="Arial"/>
+          <w:b w:val="0"/>
+          <w:i w:val="0"/>
           <w:color w:val="000000"/>
-          <w:sz w:val="19"/>
+          <w:sz w:val="20"/>
         </w:rPr>
-        <w:t xml:space="preserve">• </w:t>
-      </w:r>
-      <w:r>
-        <w:rPr>
-          <w:rFonts w:ascii="Arial" w:hAnsi="Arial"/>
-          <w:color w:val="000000"/>
-          <w:sz w:val="19"/>
-        </w:rPr>
-        <w:t>Modeled content-delivery-network traffic using stochastic methods and built a simulation pipeline to evaluate machine utilization under DNSP load-balancing policies.</w:t>
+        <w:t>Developed a stochastic CDN traffic simulator to assess machine utilization and tail latency under candidate DNS load-balancing policies, modeling connection arrivals, request timing, and joint distributions of request counts, workloads, and connection lifetimes.</w:t>
       </w:r>
     </w:p>
     <w:p>
       <w:pPr>
         <w:keepNext w:val="0"/>
-        <w:spacing w:before="0" w:after="14" w:line="250" w:lineRule="auto"/>
-        <w:ind w:left="317" w:hanging="173"/>
+        <w:spacing w:before="0" w:after="40"/>
+        <w:ind w:left="170" w:hanging="130"/>
+        <w:numPr>
+          <w:ilvl w:val="0"/>
+          <w:numId w:val="10"/>
+        </w:numPr>
       </w:pPr>
       <w:r>
         <w:rPr>
           <w:rFonts w:ascii="Arial" w:hAnsi="Arial"/>
+          <w:b w:val="0"/>
+          <w:i w:val="0"/>
           <w:color w:val="000000"/>
-          <w:sz w:val="19"/>
+          <w:sz w:val="20"/>
         </w:rPr>
-        <w:t xml:space="preserve">• </w:t>
+        <w:t>Characterized five traffic categories from sampled production logs using connection-level features and k-means clustering; analyzed how traffic patterns and extreme workloads affect simulated machine utilization.</w:t>
       </w:r>
+    </w:p>
+    <w:p>
+      <w:pPr>
+        <w:keepNext w:val="0"/>
+        <w:spacing w:before="0" w:after="40"/>
+        <w:ind w:left="170" w:hanging="130"/>
+        <w:numPr>
+          <w:ilvl w:val="0"/>
+          <w:numId w:val="10"/>
+        </w:numPr>
+      </w:pPr>
       <w:r>
         <w:rPr>
           <w:rFonts w:ascii="Arial" w:hAnsi="Arial"/>
+          <w:b w:val="0"/>
+          <w:i w:val="0"/>
           <w:color w:val="000000"/>
-          <w:sz w:val="19"/>
+          <w:sz w:val="20"/>
         </w:rPr>
-        <w:t>Designed and evaluated load-balancing policies to improve tail latency for end users.</w:t>
+        <w:t>Found agreement between simulated and observed mean machine utilization; evaluated existing load-balancing policies to establish baselines for future policy comparisons.</w:t>
       </w:r>
     </w:p>
-    <w:tbl>
-      <w:tblPr>
-        <w:tblW w:type="auto" w:w="0"/>
-        <w:jc w:val="center"/>
-        <w:tblLayout w:type="fixed"/>
-        <w:tblLook w:firstColumn="1" w:firstRow="1" w:lastColumn="0" w:lastRow="0" w:noHBand="0" w:noVBand="1" w:val="04A0"/>
-        <w:tblBorders>
-          <w:top w:val="nil"/>
-          <w:left w:val="nil"/>
-          <w:bottom w:val="nil"/>
-          <w:right w:val="nil"/>
-          <w:insideH w:val="nil"/>
-          <w:insideV w:val="nil"/>
-        </w:tblBorders>
-      </w:tblPr>
-      <w:tblGrid>
-        <w:gridCol w:w="8280"/>
-        <w:gridCol w:w="2131"/>
-      </w:tblGrid>
-      <w:tr>
-        <w:tc>
-          <w:tcPr>
-            <w:tcW w:type="dxa" w:w="5184"/>
-            <w:tcMar>
-              <w:top w:w="0" w:type="dxa"/>
-              <w:start w:w="0" w:type="dxa"/>
-              <w:bottom w:w="0" w:type="dxa"/>
-              <w:end w:w="0" w:type="dxa"/>
-            </w:tcMar>
-            <w:vAlign w:val="center"/>
-          </w:tcPr>
-          <w:p>
-            <w:pPr>
-              <w:keepNext w:val="0"/>
-              <w:spacing w:before="0" w:after="0" w:line="240" w:lineRule="auto"/>
-              <w:ind w:left="0" w:firstLine="0"/>
-            </w:pPr>
-            <w:r>
-              <w:rPr>
-                <w:rFonts w:ascii="Arial" w:hAnsi="Arial"/>
-                <w:b/>
-                <w:color w:val="000000"/>
-                <w:sz w:val="19"/>
-              </w:rPr>
-              <w:t>Aetna at CVS Health, New York, NY</w:t>
-            </w:r>
-          </w:p>
-        </w:tc>
-        <w:tc>
-          <w:tcPr>
-            <w:tcW w:type="dxa" w:w="5184"/>
-            <w:tcMar>
-              <w:top w:w="0" w:type="dxa"/>
-              <w:start w:w="0" w:type="dxa"/>
-              <w:bottom w:w="0" w:type="dxa"/>
-              <w:end w:w="0" w:type="dxa"/>
-            </w:tcMar>
-            <w:vAlign w:val="center"/>
-          </w:tcPr>
-          <w:p>
-            <w:pPr>
-              <w:keepNext w:val="0"/>
-              <w:spacing w:before="0" w:after="0" w:line="240" w:lineRule="auto"/>
-              <w:ind w:left="0" w:firstLine="0"/>
-              <w:jc w:val="right"/>
-            </w:pPr>
-            <w:r>
-              <w:rPr>
-                <w:rFonts w:ascii="Arial" w:hAnsi="Arial"/>
-                <w:color w:val="000000"/>
-                <w:sz w:val="19"/>
-              </w:rPr>
-              <w:t>Jun 2021 - Jul 2022</w:t>
-            </w:r>
-          </w:p>
-        </w:tc>
-      </w:tr>
-    </w:tbl>
     <w:p>
       <w:pPr>
-        <w:keepNext w:val="0"/>
-        <w:spacing w:before="0" w:after="9" w:line="240" w:lineRule="auto"/>
-        <w:ind w:left="0" w:firstLine="0"/>
+        <w:keepNext/>
+        <w:tabs>
+          <w:tab w:pos="10570" w:val="right"/>
+        </w:tabs>
+        <w:spacing w:before="80" w:after="40"/>
       </w:pPr>
       <w:r>
         <w:rPr>
           <w:rFonts w:ascii="Arial" w:hAnsi="Arial"/>
           <w:b/>
+          <w:i w:val="0"/>
           <w:color w:val="000000"/>
-          <w:sz w:val="18"/>
+          <w:sz w:val="20"/>
         </w:rPr>
-        <w:t>DATA SCIENTIST</w:t>
+        <w:t>Aetna at CVS Health | Data Scientist</w:t>
+      </w:r>
+      <w:r>
+        <w:rPr>
+          <w:rFonts w:ascii="Arial" w:hAnsi="Arial"/>
+          <w:b w:val="0"/>
+          <w:i w:val="0"/>
+          <w:color w:val="000000"/>
+          <w:sz w:val="20"/>
+        </w:rPr>
+        <w:tab/>
+        <w:t>Jun 2021 - Jul 2022</w:t>
       </w:r>
     </w:p>
     <w:p>
       <w:pPr>
         <w:keepNext w:val="0"/>
-        <w:spacing w:before="0" w:after="9" w:line="250" w:lineRule="auto"/>
-        <w:ind w:left="317" w:hanging="173"/>
+        <w:spacing w:before="0" w:after="40"/>
+        <w:ind w:left="170" w:hanging="130"/>
+        <w:numPr>
+          <w:ilvl w:val="0"/>
+          <w:numId w:val="10"/>
+        </w:numPr>
       </w:pPr>
       <w:r>
         <w:rPr>
           <w:rFonts w:ascii="Arial" w:hAnsi="Arial"/>
+          <w:b w:val="0"/>
+          <w:i w:val="0"/>
           <w:color w:val="000000"/>
-          <w:sz w:val="19"/>
+          <w:sz w:val="20"/>
         </w:rPr>
-        <w:t xml:space="preserve">• </w:t>
+        <w:t xml:space="preserve">Built a distributed Monte Carlo simulation pipeline to estimate member disenrollment, completing </w:t>
       </w:r>
       <w:r>
         <w:rPr>
           <w:rFonts w:ascii="Arial" w:hAnsi="Arial"/>
+          <w:b/>
+          <w:i w:val="0"/>
           <w:color w:val="000000"/>
-          <w:sz w:val="19"/>
+          <w:sz w:val="20"/>
         </w:rPr>
-        <w:t>Built a distributed Monte Carlo simulation pipeline for member-disenrollment estimation, completing 100K+ simulations on datasets with millions of rows within one hour through parallelization and vectorization.</w:t>
+        <w:t>100K+</w:t>
+      </w:r>
+      <w:r>
+        <w:rPr>
+          <w:rFonts w:ascii="Arial" w:hAnsi="Arial"/>
+          <w:b w:val="0"/>
+          <w:i w:val="0"/>
+          <w:color w:val="000000"/>
+          <w:sz w:val="20"/>
+        </w:rPr>
+        <w:t xml:space="preserve"> simulations on datasets with millions of rows within one hour through parallelization and vectorization.</w:t>
       </w:r>
     </w:p>
     <w:p>
       <w:pPr>
         <w:keepNext w:val="0"/>
-        <w:spacing w:before="0" w:after="5" w:line="250" w:lineRule="auto"/>
-        <w:ind w:left="317" w:hanging="173"/>
+        <w:spacing w:before="0" w:after="40"/>
+        <w:ind w:left="170" w:hanging="130"/>
+        <w:numPr>
+          <w:ilvl w:val="0"/>
+          <w:numId w:val="10"/>
+        </w:numPr>
       </w:pPr>
       <w:r>
         <w:rPr>
           <w:rFonts w:ascii="Arial" w:hAnsi="Arial"/>
+          <w:b w:val="0"/>
+          <w:i w:val="0"/>
           <w:color w:val="000000"/>
-          <w:sz w:val="19"/>
+          <w:sz w:val="20"/>
         </w:rPr>
-        <w:t xml:space="preserve">• </w:t>
-      </w:r>
-      <w:r>
-        <w:rPr>
-          <w:rFonts w:ascii="Arial" w:hAnsi="Arial"/>
-          <w:color w:val="000000"/>
-          <w:sz w:val="19"/>
-        </w:rPr>
-        <w:t>Developed optimization and machine-learning methods for campaign experimental design, risk-cohort identification, and member churn analysis using quadratic programming, Dask, Hive, and supervised learning.</w:t>
+        <w:t>Developed optimization and machine-learning methods for experimental design of campaigns, risk-cohort identification, and churn analysis using quadratic programming, Dask, Hive, and supervised learning.</w:t>
       </w:r>
     </w:p>
     <w:p>
       <w:pPr>
+        <w:pStyle w:val="Heading1"/>
         <w:keepNext/>
-        <w:spacing w:before="116" w:after="44" w:line="240" w:lineRule="auto"/>
-        <w:ind w:left="0" w:firstLine="0"/>
+        <w:spacing w:before="120" w:after="60"/>
         <w:jc w:val="center"/>
         <w:pBdr>
-          <w:bottom w:val="single" w:sz="7" w:space="1" w:color="000000"/>
+          <w:bottom w:val="single" w:sz="4" w:space="2" w:color="555555"/>
         </w:pBdr>
       </w:pPr>
       <w:r>
         <w:rPr>
           <w:rFonts w:ascii="Arial" w:hAnsi="Arial"/>
           <w:b/>
+          <w:i w:val="0"/>
           <w:color w:val="000000"/>
           <w:sz w:val="21"/>
         </w:rPr>
@@ -858,408 +675,166 @@
     </w:p>
     <w:p>
       <w:pPr>
-        <w:keepNext w:val="0"/>
-        <w:spacing w:before="0" w:after="3" w:line="245" w:lineRule="auto"/>
-        <w:ind w:left="0" w:firstLine="0"/>
+        <w:keepNext/>
+        <w:spacing w:before="40" w:after="0"/>
+      </w:pPr>
+      <w:hyperlink r:id="rId14">
+        <w:r>
+          <w:rPr>
+            <w:rFonts w:ascii="Arial" w:hAnsi="Arial"/>
+            <w:sz w:val="19"/>
+            <w:color w:val="000000"/>
+            <w:b/>
+          </w:rPr>
+          <w:t>Atomic Proximal Policy Optimization for Electric Robo-Taxi Dispatch and Charger Allocation</w:t>
+        </w:r>
+      </w:hyperlink>
+    </w:p>
+    <w:p>
+      <w:pPr>
+        <w:keepNext/>
+        <w:spacing w:before="0" w:after="0"/>
       </w:pPr>
       <w:r>
         <w:rPr>
           <w:rFonts w:ascii="Arial" w:hAnsi="Arial"/>
-          <w:b/>
-          <w:color w:val="000000"/>
-          <w:sz w:val="18"/>
-        </w:rPr>
-        <w:t>Atomic Proximal Policy Optimization for Electric Robo-Taxi Dispatch and Charger Allocation</w:t>
-      </w:r>
-      <w:r>
-        <w:rPr>
-          <w:rFonts w:ascii="Arial" w:hAnsi="Arial"/>
-          <w:color w:val="000000"/>
-          <w:sz w:val="18"/>
-        </w:rPr>
-        <w:t xml:space="preserve">  </w:t>
-      </w:r>
-      <w:r>
-        <w:rPr>
-          <w:rFonts w:ascii="Arial" w:hAnsi="Arial"/>
+          <w:b w:val="0"/>
           <w:i/>
           <w:color w:val="000000"/>
           <w:sz w:val="18"/>
         </w:rPr>
-        <w:t>Minor Revision, Transportation Science</w:t>
+        <w:t>With Jim Dai and Manxi Wu | Transportation Science: minor revision</w:t>
       </w:r>
     </w:p>
     <w:p>
       <w:pPr>
         <w:keepNext w:val="0"/>
-        <w:spacing w:before="0" w:after="11" w:line="240" w:lineRule="auto"/>
-        <w:ind w:left="101" w:firstLine="0"/>
+        <w:spacing w:before="0" w:after="20"/>
       </w:pPr>
       <w:r>
         <w:rPr>
           <w:rFonts w:ascii="Arial" w:hAnsi="Arial"/>
+          <w:b w:val="0"/>
+          <w:i w:val="0"/>
           <w:color w:val="000000"/>
-          <w:sz w:val="17"/>
+          <w:sz w:val="19"/>
         </w:rPr>
-        <w:t xml:space="preserve">Jim Dai, Manxi Wu, </w:t>
+        <w:t>A scalable reinforcement learning algorithm addresses dispatch and charging in an average-reward Markov decision process (MDP), with benchmark comparisons using NYC trip records.</w:t>
       </w:r>
+    </w:p>
+    <w:p>
+      <w:pPr>
+        <w:keepNext/>
+        <w:spacing w:before="40" w:after="0"/>
+      </w:pPr>
+      <w:hyperlink r:id="rId15">
+        <w:r>
+          <w:rPr>
+            <w:rFonts w:ascii="Arial" w:hAnsi="Arial"/>
+            <w:sz w:val="19"/>
+            <w:color w:val="000000"/>
+            <w:b/>
+          </w:rPr>
+          <w:t>Optimal Batched Scheduling of Stochastic Processing Networks Using Atomic Action Decomposition</w:t>
+        </w:r>
+      </w:hyperlink>
+    </w:p>
+    <w:p>
+      <w:pPr>
+        <w:keepNext/>
+        <w:spacing w:before="0" w:after="0"/>
+      </w:pPr>
       <w:r>
         <w:rPr>
           <w:rFonts w:ascii="Arial" w:hAnsi="Arial"/>
-          <w:b/>
+          <w:b w:val="0"/>
+          <w:i/>
           <w:color w:val="000000"/>
-          <w:sz w:val="17"/>
+          <w:sz w:val="18"/>
         </w:rPr>
-        <w:t>Zhanhao Zhang</w:t>
+        <w:t>With Jim Dai and Manxi Wu | Management Science: major revision, revision submitted</w:t>
       </w:r>
     </w:p>
     <w:p>
       <w:pPr>
         <w:keepNext w:val="0"/>
-        <w:spacing w:before="0" w:after="3" w:line="245" w:lineRule="auto"/>
-        <w:ind w:left="0" w:firstLine="0"/>
+        <w:spacing w:before="0" w:after="20"/>
       </w:pPr>
       <w:r>
         <w:rPr>
           <w:rFonts w:ascii="Arial" w:hAnsi="Arial"/>
-          <w:b/>
+          <w:b w:val="0"/>
+          <w:i w:val="0"/>
           <w:color w:val="000000"/>
-          <w:sz w:val="18"/>
+          <w:sz w:val="19"/>
         </w:rPr>
-        <w:t>Optimal Batched Scheduling of Stochastic Processing Networks Using Atomic Action Decomposition</w:t>
+        <w:t>Atomic action decomposition of the scheduling MDP preserves the optimal long-run average reward while keeping the policy dimension independent of the number of servers.</w:t>
       </w:r>
+    </w:p>
+    <w:p>
+      <w:pPr>
+        <w:keepNext/>
+        <w:spacing w:before="40" w:after="0"/>
+      </w:pPr>
+      <w:hyperlink r:id="rId16">
+        <w:r>
+          <w:rPr>
+            <w:rFonts w:ascii="Arial" w:hAnsi="Arial"/>
+            <w:sz w:val="19"/>
+            <w:color w:val="000000"/>
+            <w:b/>
+          </w:rPr>
+          <w:t>Deep Learning Method for Stationary Distribution of Reflected Brownian Motion</w:t>
+        </w:r>
+      </w:hyperlink>
+    </w:p>
+    <w:p>
+      <w:pPr>
+        <w:keepNext/>
+        <w:spacing w:before="0" w:after="0"/>
+      </w:pPr>
       <w:r>
         <w:rPr>
           <w:rFonts w:ascii="Arial" w:hAnsi="Arial"/>
-          <w:color w:val="000000"/>
-          <w:sz w:val="18"/>
-        </w:rPr>
-        <w:t xml:space="preserve">  </w:t>
-      </w:r>
-      <w:r>
-        <w:rPr>
-          <w:rFonts w:ascii="Arial" w:hAnsi="Arial"/>
+          <w:b w:val="0"/>
           <w:i/>
           <w:color w:val="000000"/>
           <w:sz w:val="18"/>
         </w:rPr>
-        <w:t>Major Revision, Management Science; Revision Submitted</w:t>
+        <w:t>With Jim Dai | Submitted to Stochastic Systems</w:t>
       </w:r>
     </w:p>
     <w:p>
       <w:pPr>
         <w:keepNext w:val="0"/>
-        <w:spacing w:before="0" w:after="11" w:line="240" w:lineRule="auto"/>
-        <w:ind w:left="101" w:firstLine="0"/>
+        <w:spacing w:before="0" w:after="20"/>
       </w:pPr>
       <w:r>
         <w:rPr>
           <w:rFonts w:ascii="Arial" w:hAnsi="Arial"/>
+          <w:b w:val="0"/>
+          <w:i w:val="0"/>
           <w:color w:val="000000"/>
-          <w:sz w:val="17"/>
+          <w:sz w:val="19"/>
         </w:rPr>
-        <w:t xml:space="preserve">Jim Dai, Manxi Wu, </w:t>
-      </w:r>
-      <w:r>
-        <w:rPr>
-          <w:rFonts w:ascii="Arial" w:hAnsi="Arial"/>
-          <w:b/>
-          <w:color w:val="000000"/>
-          <w:sz w:val="17"/>
-        </w:rPr>
-        <w:t>Zhanhao Zhang</w:t>
+        <w:t>A deep learning method learns Laplace transforms to estimate stationary tail probabilities in high dimensions.</w:t>
       </w:r>
     </w:p>
     <w:p>
       <w:pPr>
-        <w:keepNext w:val="0"/>
-        <w:spacing w:before="0" w:after="3" w:line="245" w:lineRule="auto"/>
-        <w:ind w:left="0" w:firstLine="0"/>
-      </w:pPr>
-      <w:r>
-        <w:rPr>
-          <w:rFonts w:ascii="Arial" w:hAnsi="Arial"/>
-          <w:b/>
-          <w:color w:val="000000"/>
-          <w:sz w:val="18"/>
-        </w:rPr>
-        <w:t>Deep Learning Method for Stationary Distribution of Reflected Brownian Motion</w:t>
-      </w:r>
-      <w:r>
-        <w:rPr>
-          <w:rFonts w:ascii="Arial" w:hAnsi="Arial"/>
-          <w:color w:val="000000"/>
-          <w:sz w:val="18"/>
-        </w:rPr>
-        <w:t xml:space="preserve">  </w:t>
-      </w:r>
-      <w:r>
-        <w:rPr>
-          <w:rFonts w:ascii="Arial" w:hAnsi="Arial"/>
-          <w:i/>
-          <w:color w:val="000000"/>
-          <w:sz w:val="18"/>
-        </w:rPr>
-        <w:t>Submitted, Stochastic Systems</w:t>
-      </w:r>
-    </w:p>
-    <w:p>
-      <w:pPr>
-        <w:keepNext w:val="0"/>
-        <w:spacing w:before="0" w:after="11" w:line="240" w:lineRule="auto"/>
-        <w:ind w:left="101" w:firstLine="0"/>
-      </w:pPr>
-      <w:r>
-        <w:rPr>
-          <w:rFonts w:ascii="Arial" w:hAnsi="Arial"/>
-          <w:color w:val="000000"/>
-          <w:sz w:val="17"/>
-        </w:rPr>
-        <w:t xml:space="preserve">Jim Dai, </w:t>
-      </w:r>
-      <w:r>
-        <w:rPr>
-          <w:rFonts w:ascii="Arial" w:hAnsi="Arial"/>
-          <w:b/>
-          <w:color w:val="000000"/>
-          <w:sz w:val="17"/>
-        </w:rPr>
-        <w:t>Zhanhao Zhang</w:t>
-      </w:r>
-    </w:p>
-    <w:p>
-      <w:pPr>
-        <w:keepNext w:val="0"/>
-        <w:spacing w:before="0" w:after="3" w:line="245" w:lineRule="auto"/>
-        <w:ind w:left="0" w:firstLine="0"/>
-      </w:pPr>
-      <w:r>
-        <w:rPr>
-          <w:rFonts w:ascii="Arial" w:hAnsi="Arial"/>
-          <w:b/>
-          <w:sz w:val="18"/>
-        </w:rPr>
-        <w:t>Generative Market Equilibrium Models with Stable Adversarial Learning via Reinforcement Link</w:t>
-      </w:r>
-      <w:r>
-        <w:rPr>
-          <w:rFonts w:ascii="Arial" w:hAnsi="Arial"/>
-          <w:sz w:val="18"/>
-        </w:rPr>
-        <w:t xml:space="preserve">  </w:t>
-      </w:r>
-      <w:r>
-        <w:rPr>
-          <w:rFonts w:ascii="Arial" w:hAnsi="Arial"/>
-          <w:i/>
-          <w:sz w:val="18"/>
-        </w:rPr>
-        <w:t>Major Revision, SIAM Journal on Financial Mathematics; Revision Submitted</w:t>
-      </w:r>
-    </w:p>
-    <w:p>
-      <w:pPr>
-        <w:keepNext w:val="0"/>
-        <w:spacing w:before="0" w:after="11" w:line="240" w:lineRule="auto"/>
-        <w:ind w:left="101" w:firstLine="0"/>
-      </w:pPr>
-      <w:r>
-        <w:rPr>
-          <w:rFonts w:ascii="Arial" w:hAnsi="Arial"/>
-          <w:sz w:val="17"/>
-        </w:rPr>
-        <w:t xml:space="preserve">Anastasis Kratsios, Xiaofei Shi, Qiang Sun, </w:t>
-      </w:r>
-      <w:r>
-        <w:rPr>
-          <w:rFonts w:ascii="Arial" w:hAnsi="Arial"/>
-          <w:b/>
-          <w:sz w:val="17"/>
-        </w:rPr>
-        <w:t>Zhanhao Zhang</w:t>
-      </w:r>
-    </w:p>
-    <w:p>
-      <w:pPr>
-        <w:keepNext w:val="0"/>
-        <w:spacing w:before="0" w:after="3" w:line="245" w:lineRule="auto"/>
-        <w:ind w:left="0" w:firstLine="0"/>
-      </w:pPr>
-      <w:r>
-        <w:rPr>
-          <w:rFonts w:ascii="Arial" w:hAnsi="Arial" w:eastAsia="Arial"/>
-          <w:b/>
-          <w:sz w:val="18"/>
-        </w:rPr>
-        <w:t>Mixed-Type Courier Dispatch for Online Food Delivery Platforms</w:t>
-      </w:r>
-      <w:r>
-        <w:rPr>
-          <w:rFonts w:ascii="Arial" w:hAnsi="Arial" w:eastAsia="Arial"/>
-          <w:sz w:val="18"/>
-        </w:rPr>
-        <w:t xml:space="preserve">  </w:t>
-      </w:r>
-      <w:r>
-        <w:rPr>
-          <w:rFonts w:ascii="Arial" w:hAnsi="Arial" w:eastAsia="Arial"/>
-          <w:i/>
-          <w:sz w:val="18"/>
-        </w:rPr>
-        <w:t>Major Revision, Transportation Science; Revision Submitted</w:t>
-      </w:r>
-    </w:p>
-    <w:p>
-      <w:pPr>
-        <w:keepNext w:val="0"/>
-        <w:spacing w:before="0" w:after="11" w:line="240" w:lineRule="auto"/>
-        <w:ind w:left="101" w:firstLine="0"/>
-      </w:pPr>
-      <w:r>
-        <w:rPr>
-          <w:rFonts w:ascii="Arial" w:hAnsi="Arial" w:eastAsia="Arial"/>
-          <w:sz w:val="17"/>
-        </w:rPr>
-        <w:t xml:space="preserve">Junlin Chen, Manxi Wu, Chiwei Yan, </w:t>
-      </w:r>
-      <w:r>
-        <w:rPr>
-          <w:rFonts w:ascii="Arial" w:hAnsi="Arial" w:eastAsia="Arial"/>
-          <w:b/>
-          <w:sz w:val="17"/>
-        </w:rPr>
-        <w:t>Zhanhao Zhang</w:t>
-      </w:r>
-    </w:p>
-    <w:p>
-      <w:pPr>
+        <w:pStyle w:val="Heading1"/>
         <w:keepNext/>
-        <w:spacing w:before="116" w:after="44" w:line="240" w:lineRule="auto"/>
-        <w:ind w:left="0" w:firstLine="0"/>
+        <w:spacing w:before="120" w:after="60"/>
         <w:jc w:val="center"/>
         <w:pBdr>
-          <w:bottom w:val="single" w:sz="7" w:space="1" w:color="000000"/>
+          <w:bottom w:val="single" w:sz="4" w:space="2" w:color="555555"/>
         </w:pBdr>
       </w:pPr>
       <w:r>
         <w:rPr>
           <w:rFonts w:ascii="Arial" w:hAnsi="Arial"/>
           <w:b/>
-          <w:color w:val="000000"/>
-          <w:sz w:val="21"/>
-        </w:rPr>
-        <w:t>HONORS &amp; TEACHING</w:t>
-      </w:r>
-    </w:p>
-    <w:p>
-      <w:pPr>
-        <w:keepNext w:val="0"/>
-        <w:spacing w:before="0" w:after="6" w:line="240" w:lineRule="auto"/>
-        <w:ind w:left="0" w:firstLine="0"/>
-      </w:pPr>
-      <w:r>
-        <w:rPr>
-          <w:rFonts w:ascii="Arial" w:hAnsi="Arial"/>
-          <w:b/>
-          <w:color w:val="000000"/>
-          <w:sz w:val="18"/>
-        </w:rPr>
-        <w:t>Outstanding Teaching Assistant Award, Cornell ORIE</w:t>
-      </w:r>
-      <w:r>
-        <w:rPr>
-          <w:rFonts w:ascii="Arial" w:hAnsi="Arial"/>
-          <w:color w:val="000000"/>
-          <w:sz w:val="18"/>
-        </w:rPr>
-        <w:t xml:space="preserve">  |  2026</w:t>
-      </w:r>
-    </w:p>
-    <w:p>
-      <w:pPr>
-        <w:keepNext w:val="0"/>
-        <w:spacing w:before="0" w:after="6" w:line="240" w:lineRule="auto"/>
-        <w:ind w:left="0" w:firstLine="0"/>
-      </w:pPr>
-      <w:r>
-        <w:rPr>
-          <w:rFonts w:ascii="Arial" w:hAnsi="Arial"/>
-          <w:b/>
-          <w:color w:val="000000"/>
-          <w:sz w:val="18"/>
-        </w:rPr>
-        <w:t>INFORMS TSL Data-Driven Research Challenge - Finalist</w:t>
-      </w:r>
-      <w:r>
-        <w:rPr>
-          <w:rFonts w:ascii="Arial" w:hAnsi="Arial"/>
-          <w:color w:val="000000"/>
-          <w:sz w:val="18"/>
-        </w:rPr>
-        <w:t xml:space="preserve">  |  May 2025</w:t>
-      </w:r>
-    </w:p>
-    <w:p>
-      <w:pPr>
-        <w:keepNext w:val="0"/>
-        <w:spacing w:before="0" w:after="6" w:line="240" w:lineRule="auto"/>
-        <w:ind w:left="0" w:firstLine="0"/>
-      </w:pPr>
-      <w:r>
-        <w:rPr>
-          <w:rFonts w:ascii="Arial" w:hAnsi="Arial" w:eastAsia="Arial"/>
-          <w:b/>
-          <w:sz w:val="18"/>
-        </w:rPr>
-        <w:t>Cornell Fellowship, Cornell University</w:t>
-      </w:r>
-      <w:r>
-        <w:rPr>
-          <w:rFonts w:ascii="Arial" w:hAnsi="Arial" w:eastAsia="Arial"/>
-          <w:sz w:val="18"/>
-        </w:rPr>
-        <w:t xml:space="preserve">  |  Jan 2023 - May 2023</w:t>
-      </w:r>
-    </w:p>
-    <w:p>
-      <w:pPr>
-        <w:keepNext w:val="0"/>
-        <w:spacing w:before="0" w:after="3" w:line="240" w:lineRule="auto"/>
-        <w:ind w:left="0" w:firstLine="0"/>
-      </w:pPr>
-      <w:r>
-        <w:rPr>
-          <w:rFonts w:ascii="Arial" w:hAnsi="Arial"/>
-          <w:b/>
-          <w:color w:val="000000"/>
-          <w:sz w:val="18"/>
-        </w:rPr>
-        <w:t>Instructor, Big Data Technologies, Cornell University</w:t>
-      </w:r>
-      <w:r>
-        <w:rPr>
-          <w:rFonts w:ascii="Arial" w:hAnsi="Arial"/>
-          <w:color w:val="000000"/>
-          <w:sz w:val="18"/>
-        </w:rPr>
-        <w:t xml:space="preserve">  |  Spring 2024, 2025, 2026</w:t>
-      </w:r>
-    </w:p>
-    <w:p>
-      <w:pPr>
-        <w:keepNext/>
-        <w:spacing w:before="116" w:after="44" w:line="240" w:lineRule="auto"/>
-        <w:ind w:left="0" w:firstLine="0"/>
-        <w:jc w:val="center"/>
-        <w:keepLines/>
-        <w:pBdr>
-          <w:bottom w:val="single" w:sz="7" w:space="1" w:color="000000"/>
-        </w:pBdr>
-      </w:pPr>
-      <w:r>
-        <w:rPr>
-          <w:rFonts w:ascii="Arial" w:hAnsi="Arial"/>
-          <w:b/>
+          <w:i w:val="0"/>
           <w:color w:val="000000"/>
           <w:sz w:val="21"/>
         </w:rPr>
@@ -1269,47 +844,51 @@
     <w:p>
       <w:pPr>
         <w:keepNext w:val="0"/>
-        <w:keepLines/>
-        <w:spacing w:before="0" w:after="3" w:line="240" w:lineRule="auto"/>
-        <w:ind w:left="0" w:firstLine="0"/>
+        <w:spacing w:before="0" w:after="0"/>
       </w:pPr>
       <w:r>
         <w:rPr>
-          <w:rFonts w:ascii="Arial" w:hAnsi="Arial" w:eastAsia="Arial"/>
+          <w:rFonts w:ascii="Arial" w:hAnsi="Arial"/>
           <w:b/>
-          <w:sz w:val="18"/>
+          <w:i w:val="0"/>
+          <w:color w:val="000000"/>
+          <w:sz w:val="19"/>
         </w:rPr>
         <w:t xml:space="preserve">Methods: </w:t>
       </w:r>
       <w:r>
         <w:rPr>
-          <w:rFonts w:ascii="Arial" w:hAnsi="Arial" w:eastAsia="Arial"/>
-          <w:sz w:val="18"/>
+          <w:rFonts w:ascii="Arial" w:hAnsi="Arial"/>
+          <w:b w:val="0"/>
+          <w:i w:val="0"/>
+          <w:color w:val="000000"/>
+          <w:sz w:val="19"/>
         </w:rPr>
-        <w:t>Reinforcement Learning, LLM Agents, Optimization, Stochastic Modeling, Simulation, Parallel/Distributed Computing</w:t>
+        <w:t>Reinforcement learning, LLM agents, optimization, stochastic modeling, simulation</w:t>
       </w:r>
     </w:p>
     <w:p>
       <w:pPr>
         <w:keepNext w:val="0"/>
-        <w:keepLines/>
-        <w:spacing w:before="0" w:after="3" w:line="240" w:lineRule="auto"/>
-        <w:ind w:left="0" w:firstLine="0"/>
+        <w:spacing w:before="0" w:after="0"/>
       </w:pPr>
       <w:r>
         <w:rPr>
           <w:rFonts w:ascii="Arial" w:hAnsi="Arial"/>
           <w:b/>
+          <w:i w:val="0"/>
           <w:color w:val="000000"/>
-          <w:sz w:val="18"/>
+          <w:sz w:val="19"/>
         </w:rPr>
         <w:t xml:space="preserve">Languages: </w:t>
       </w:r>
       <w:r>
         <w:rPr>
           <w:rFonts w:ascii="Arial" w:hAnsi="Arial"/>
+          <w:b w:val="0"/>
+          <w:i w:val="0"/>
           <w:color w:val="000000"/>
-          <w:sz w:val="18"/>
+          <w:sz w:val="19"/>
         </w:rPr>
         <w:t>Python, SQL, C/C++, R, Bash</w:t>
       </w:r>
@@ -1317,61 +896,112 @@
     <w:p>
       <w:pPr>
         <w:keepNext w:val="0"/>
-        <w:keepLines/>
-        <w:spacing w:before="0" w:after="3" w:line="240" w:lineRule="auto"/>
-        <w:ind w:left="0" w:firstLine="0"/>
+        <w:spacing w:before="0" w:after="0"/>
       </w:pPr>
       <w:r>
         <w:rPr>
           <w:rFonts w:ascii="Arial" w:hAnsi="Arial"/>
           <w:b/>
+          <w:i w:val="0"/>
           <w:color w:val="000000"/>
-          <w:sz w:val="18"/>
+          <w:sz w:val="19"/>
         </w:rPr>
-        <w:t xml:space="preserve">ML / Scientific Computing: </w:t>
+        <w:t xml:space="preserve">Tools: </w:t>
       </w:r>
       <w:r>
         <w:rPr>
           <w:rFonts w:ascii="Arial" w:hAnsi="Arial"/>
+          <w:b w:val="0"/>
+          <w:i w:val="0"/>
           <w:color w:val="000000"/>
-          <w:sz w:val="18"/>
+          <w:sz w:val="19"/>
         </w:rPr>
-        <w:t>PyTorch, NumPy, SciPy, scikit-learn, Pandas</w:t>
+        <w:t>PyTorch, NumPy, SciPy, scikit-learn, Pandas, PySpark, Dask, Hive, Joblib, Git</w:t>
+      </w:r>
+    </w:p>
+    <w:p>
+      <w:pPr>
+        <w:pStyle w:val="Heading1"/>
+        <w:keepNext/>
+        <w:spacing w:before="120" w:after="60"/>
+        <w:jc w:val="center"/>
+        <w:pBdr>
+          <w:bottom w:val="single" w:sz="4" w:space="2" w:color="555555"/>
+        </w:pBdr>
+      </w:pPr>
+      <w:r>
+        <w:rPr>
+          <w:rFonts w:ascii="Arial" w:hAnsi="Arial"/>
+          <w:b/>
+          <w:i w:val="0"/>
+          <w:color w:val="000000"/>
+          <w:sz w:val="21"/>
+        </w:rPr>
+        <w:t>HONORS AND TEACHING</w:t>
       </w:r>
     </w:p>
     <w:p>
       <w:pPr>
         <w:keepNext w:val="0"/>
-        <w:keepLines/>
-        <w:spacing w:before="0" w:after="3" w:line="240" w:lineRule="auto"/>
-        <w:ind w:left="0" w:firstLine="0"/>
+        <w:spacing w:before="0" w:after="0"/>
       </w:pPr>
       <w:r>
         <w:rPr>
           <w:rFonts w:ascii="Arial" w:hAnsi="Arial"/>
-          <w:b/>
+          <w:b w:val="0"/>
+          <w:i w:val="0"/>
           <w:color w:val="000000"/>
           <w:sz w:val="18"/>
         </w:rPr>
-        <w:t xml:space="preserve">Data / Systems: </w:t>
+        <w:t>INFORMS TSL Data-Driven Research Challenge finalist (2025) | Cornell ORIE Outstanding Teaching Assistant Award (2026)</w:t>
       </w:r>
+    </w:p>
+    <w:p>
+      <w:pPr>
+        <w:keepNext w:val="0"/>
+        <w:spacing w:before="0" w:after="0"/>
+      </w:pPr>
       <w:r>
         <w:rPr>
           <w:rFonts w:ascii="Arial" w:hAnsi="Arial"/>
+          <w:b w:val="0"/>
+          <w:i w:val="0"/>
           <w:color w:val="000000"/>
           <w:sz w:val="18"/>
         </w:rPr>
-        <w:t>PySpark, Hive, Joblib, Git</w:t>
+        <w:t>Instructor, Big Data Technologies, Cornell University (Spring 2024, 2025, 2026)</w:t>
       </w:r>
     </w:p>
     <w:sectPr>
+      <w:headerReference w:type="default" r:id="rId10"/>
+      <w:footerReference w:type="default" r:id="rId11"/>
       <w:pgSz w:w="12240" w:h="15840"/>
-      <w:pgMar w:top="662" w:right="936" w:bottom="662" w:left="936" w:header="288" w:footer="288" w:gutter="0"/>
+      <w:pgMar w:top="619" w:right="835" w:bottom="619" w:left="835" w:header="259" w:footer="259" w:gutter="0"/>
       <w:cols w:space="720"/>
       <w:docGrid w:linePitch="360"/>
     </w:sectPr>
   </w:body>
 </w:document>
+</file>
+
+<file path=word/footer1.xml><?xml version="1.0" encoding="utf-8"?>
+<w:ftr xmlns:m="http://schemas.openxmlformats.org/officeDocument/2006/math" xmlns:mc="http://schemas.openxmlformats.org/markup-compatibility/2006" xmlns:mo="http://schemas.microsoft.com/office/mac/office/2008/main" xmlns:mv="urn:schemas-microsoft-com:mac:vml" xmlns:o="urn:schemas-microsoft-com:office:office" xmlns:r="http://schemas.openxmlformats.org/officeDocument/2006/relationships" xmlns:v="urn:schemas-microsoft-com:vml" xmlns:w10="urn:schemas-microsoft-com:office:word" xmlns:w14="http://schemas.microsoft.com/office/word/2010/wordml" xmlns:w="http://schemas.openxmlformats.org/wordprocessingml/2006/main" xmlns:wne="http://schemas.microsoft.com/office/word/2006/wordml" xmlns:wp14="http://schemas.microsoft.com/office/word/2010/wordprocessingDrawing" xmlns:wp="http://schemas.openxmlformats.org/drawingml/2006/wordprocessingDrawing" xmlns:wpc="http://schemas.microsoft.com/office/word/2010/wordprocessingCanvas" xmlns:wpg="http://schemas.microsoft.com/office/word/2010/wordprocessingGroup" xmlns:wpi="http://schemas.microsoft.com/office/word/2010/wordprocessingInk" xmlns:wps="http://schemas.microsoft.com/office/word/2010/wordprocessingShape" mc:Ignorable="w14 wp14">
+  <w:p>
+    <w:pPr>
+      <w:pStyle w:val="Footer"/>
+    </w:pPr>
+  </w:p>
+</w:ftr>
+</file>
+
+<file path=word/header1.xml><?xml version="1.0" encoding="utf-8"?>
+<w:hdr xmlns:m="http://schemas.openxmlformats.org/officeDocument/2006/math" xmlns:mc="http://schemas.openxmlformats.org/markup-compatibility/2006" xmlns:mo="http://schemas.microsoft.com/office/mac/office/2008/main" xmlns:mv="urn:schemas-microsoft-com:mac:vml" xmlns:o="urn:schemas-microsoft-com:office:office" xmlns:r="http://schemas.openxmlformats.org/officeDocument/2006/relationships" xmlns:v="urn:schemas-microsoft-com:vml" xmlns:w10="urn:schemas-microsoft-com:office:word" xmlns:w14="http://schemas.microsoft.com/office/word/2010/wordml" xmlns:w="http://schemas.openxmlformats.org/wordprocessingml/2006/main" xmlns:wne="http://schemas.microsoft.com/office/word/2006/wordml" xmlns:wp14="http://schemas.microsoft.com/office/word/2010/wordprocessingDrawing" xmlns:wp="http://schemas.openxmlformats.org/drawingml/2006/wordprocessingDrawing" xmlns:wpc="http://schemas.microsoft.com/office/word/2010/wordprocessingCanvas" xmlns:wpg="http://schemas.microsoft.com/office/word/2010/wordprocessingGroup" xmlns:wpi="http://schemas.microsoft.com/office/word/2010/wordprocessingInk" xmlns:wps="http://schemas.microsoft.com/office/word/2010/wordprocessingShape" mc:Ignorable="w14 wp14">
+  <w:p>
+    <w:pPr>
+      <w:pStyle w:val="Header"/>
+    </w:pPr>
+  </w:p>
+</w:hdr>
 </file>
 
 <file path=word/numbering.xml><?xml version="1.0" encoding="utf-8"?>
@@ -1573,6 +1203,23 @@
   </w:num>
   <w:num w:numId="9">
     <w:abstractNumId w:val="0"/>
+  </w:num>
+  <w:abstractNum w:abstractNumId="9">
+    <w:lvl w:ilvl="0">
+      <w:start w:val="1"/>
+      <w:numFmt w:val="bullet"/>
+      <w:lvlText w:val="•"/>
+      <w:lvlJc w:val="left"/>
+      <w:pPr>
+        <w:ind w:left="170" w:hanging="130"/>
+      </w:pPr>
+      <w:rPr>
+        <w:rFonts w:ascii="Arial" w:hAnsi="Arial"/>
+      </w:rPr>
+    </w:lvl>
+  </w:abstractNum>
+  <w:num w:numId="10">
+    <w:abstractNumId w:val="9"/>
   </w:num>
 </w:numbering>
 </file>
@@ -1737,9 +1384,15 @@
     <w:name w:val="Normal"/>
     <w:qFormat/>
     <w:rsid w:val="00FC693F"/>
+    <w:pPr>
+      <w:keepNext w:val="0"/>
+      <w:keepLines/>
+      <w:spacing w:before="0" w:after="0" w:line="240" w:lineRule="auto"/>
+    </w:pPr>
     <w:rPr>
       <w:rFonts w:ascii="Arial" w:hAnsi="Arial"/>
-      <w:sz w:val="19"/>
+      <w:color w:val="000000"/>
+      <w:sz w:val="20"/>
     </w:rPr>
   </w:style>
   <w:style w:type="paragraph" w:styleId="Header">
@@ -1795,17 +1448,17 @@
     <w:qFormat/>
     <w:rsid w:val="00FC693F"/>
     <w:pPr>
-      <w:keepNext/>
+      <w:keepNext w:val="0"/>
       <w:keepLines/>
-      <w:spacing w:before="480" w:after="0"/>
+      <w:spacing w:before="0" w:after="0" w:line="240" w:lineRule="auto"/>
       <w:outlineLvl w:val="0"/>
     </w:pPr>
     <w:rPr>
-      <w:rFonts w:asciiTheme="majorHAnsi" w:eastAsiaTheme="majorEastAsia" w:hAnsiTheme="majorHAnsi" w:cstheme="majorBidi"/>
+      <w:rFonts w:asciiTheme="majorHAnsi" w:eastAsiaTheme="majorEastAsia" w:hAnsiTheme="majorHAnsi" w:cstheme="majorBidi" w:ascii="Arial" w:hAnsi="Arial"/>
       <w:b/>
       <w:bCs/>
-      <w:color w:val="365F91" w:themeColor="accent1" w:themeShade="BF"/>
-      <w:sz w:val="28"/>
+      <w:color w:val="000000"/>
+      <w:sz w:val="20"/>
       <w:szCs w:val="28"/>
     </w:rPr>
   </w:style>
@@ -1819,17 +1472,17 @@
     <w:qFormat/>
     <w:rsid w:val="00FC693F"/>
     <w:pPr>
-      <w:keepNext/>
+      <w:keepNext w:val="0"/>
       <w:keepLines/>
-      <w:spacing w:before="200" w:after="0"/>
+      <w:spacing w:before="0" w:after="0" w:line="240" w:lineRule="auto"/>
       <w:outlineLvl w:val="1"/>
     </w:pPr>
     <w:rPr>
-      <w:rFonts w:asciiTheme="majorHAnsi" w:eastAsiaTheme="majorEastAsia" w:hAnsiTheme="majorHAnsi" w:cstheme="majorBidi"/>
+      <w:rFonts w:asciiTheme="majorHAnsi" w:eastAsiaTheme="majorEastAsia" w:hAnsiTheme="majorHAnsi" w:cstheme="majorBidi" w:ascii="Arial" w:hAnsi="Arial"/>
       <w:b/>
       <w:bCs/>
-      <w:color w:val="4F81BD" w:themeColor="accent1"/>
-      <w:sz w:val="26"/>
+      <w:color w:val="000000"/>
+      <w:sz w:val="20"/>
       <w:szCs w:val="26"/>
     </w:rPr>
   </w:style>
@@ -2083,18 +1736,17 @@
     <w:qFormat/>
     <w:rsid w:val="00FC693F"/>
     <w:pPr>
-      <w:pBdr>
-        <w:bottom w:val="single" w:sz="8" w:space="4" w:color="4F81BD" w:themeColor="accent1"/>
-      </w:pBdr>
-      <w:spacing w:after="300" w:line="240" w:lineRule="auto"/>
+      <w:keepNext w:val="0"/>
+      <w:keepLines/>
+      <w:spacing w:after="0" w:line="240" w:lineRule="auto" w:before="0"/>
       <w:contextualSpacing/>
     </w:pPr>
     <w:rPr>
-      <w:rFonts w:asciiTheme="majorHAnsi" w:eastAsiaTheme="majorEastAsia" w:hAnsiTheme="majorHAnsi" w:cstheme="majorBidi"/>
-      <w:color w:val="17365D" w:themeColor="text2" w:themeShade="BF"/>
+      <w:rFonts w:asciiTheme="majorHAnsi" w:eastAsiaTheme="majorEastAsia" w:hAnsiTheme="majorHAnsi" w:cstheme="majorBidi" w:ascii="Arial" w:hAnsi="Arial"/>
+      <w:color w:val="000000"/>
       <w:spacing w:val="5"/>
       <w:kern w:val="28"/>
-      <w:sz w:val="52"/>
+      <w:sz w:val="20"/>
       <w:szCs w:val="52"/>
     </w:rPr>
   </w:style>
@@ -2265,11 +1917,19 @@
     <w:unhideWhenUsed/>
     <w:rsid w:val="00326F90"/>
     <w:pPr>
+      <w:keepNext w:val="0"/>
+      <w:keepLines/>
       <w:numPr>
         <w:numId w:val="1"/>
       </w:numPr>
+      <w:spacing w:before="0" w:after="0" w:line="240" w:lineRule="auto"/>
       <w:contextualSpacing/>
     </w:pPr>
+    <w:rPr>
+      <w:rFonts w:ascii="Arial" w:hAnsi="Arial"/>
+      <w:color w:val="000000"/>
+      <w:sz w:val="20"/>
+    </w:rPr>
   </w:style>
   <w:style w:type="paragraph" w:styleId="ListBullet2">
     <w:name w:val="List Bullet 2"/>

</xml_diff>